<commit_message>
Actualizacion tramites casi listos
</commit_message>
<xml_diff>
--- a/formatos/cotizacion_template.docx
+++ b/formatos/cotizacion_template.docx
@@ -49,7 +49,25 @@
           <w:sz w:val="20"/>
           <w:szCs w:val="16"/>
         </w:rPr>
-        <w:t>Esmeralda N°940, Of. 31 3ER Piso</w:t>
+        <w:t xml:space="preserve">Esmeralda N°940, </w:t>
+      </w:r>
+      <w:proofErr w:type="spellStart"/>
+      <w:r>
+        <w:rPr>
+          <w:rFonts w:ascii="Tahoma" w:hAnsi="Tahoma" w:cs="Tahoma"/>
+          <w:sz w:val="20"/>
+          <w:szCs w:val="16"/>
+        </w:rPr>
+        <w:t>Of</w:t>
+      </w:r>
+      <w:proofErr w:type="spellEnd"/>
+      <w:r>
+        <w:rPr>
+          <w:rFonts w:ascii="Tahoma" w:hAnsi="Tahoma" w:cs="Tahoma"/>
+          <w:sz w:val="20"/>
+          <w:szCs w:val="16"/>
+        </w:rPr>
+        <w:t>. 31 3ER Piso</w:t>
       </w:r>
       <w:r>
         <w:rPr>
@@ -185,7 +203,25 @@
           <w:color w:val="000000"/>
           <w:sz w:val="24"/>
         </w:rPr>
-        <w:t>{{fecha_vencimiento}}</w:t>
+        <w:t>{{</w:t>
+      </w:r>
+      <w:proofErr w:type="spellStart"/>
+      <w:r>
+        <w:rPr>
+          <w:rFonts w:ascii="Tahoma" w:hAnsi="Tahoma" w:cs="Tahoma"/>
+          <w:color w:val="000000"/>
+          <w:sz w:val="24"/>
+        </w:rPr>
+        <w:t>fecha_vencimiento</w:t>
+      </w:r>
+      <w:proofErr w:type="spellEnd"/>
+      <w:r>
+        <w:rPr>
+          <w:rFonts w:ascii="Tahoma" w:hAnsi="Tahoma" w:cs="Tahoma"/>
+          <w:color w:val="000000"/>
+          <w:sz w:val="24"/>
+        </w:rPr>
+        <w:t>}}</w:t>
       </w:r>
     </w:p>
     <w:p>
@@ -229,15 +265,33 @@
           <w:color w:val="000000"/>
           <w:sz w:val="24"/>
         </w:rPr>
-        <w:t>{{cliente}}</w:t>
-      </w:r>
+        <w:t>{{cliente</w:t>
+      </w:r>
+      <w:proofErr w:type="gramStart"/>
       <w:r>
         <w:rPr>
           <w:rFonts w:ascii="Tahoma" w:hAnsi="Tahoma" w:cs="Tahoma"/>
           <w:color w:val="000000"/>
           <w:sz w:val="24"/>
         </w:rPr>
-        <w:t xml:space="preserve">     </w:t>
+        <w:t>}}</w:t>
+      </w:r>
+      <w:r>
+        <w:rPr>
+          <w:rFonts w:ascii="Tahoma" w:hAnsi="Tahoma" w:cs="Tahoma"/>
+          <w:color w:val="000000"/>
+          <w:sz w:val="24"/>
+        </w:rPr>
+        <w:t xml:space="preserve">   </w:t>
+      </w:r>
+      <w:proofErr w:type="gramEnd"/>
+      <w:r>
+        <w:rPr>
+          <w:rFonts w:ascii="Tahoma" w:hAnsi="Tahoma" w:cs="Tahoma"/>
+          <w:color w:val="000000"/>
+          <w:sz w:val="24"/>
+        </w:rPr>
+        <w:t xml:space="preserve">  </w:t>
       </w:r>
       <w:r>
         <w:rPr>
@@ -314,7 +368,7 @@
               <v:h position="#0,center" xrange="0,10800"/>
             </v:handles>
           </v:shapetype>
-          <v:shape id="_x0000_s2054" type="#_x0000_t187" style="position:absolute;margin-left:-28.65pt;margin-top:217.35pt;width:15.6pt;height:15.6pt;z-index:3" adj="6735" fillcolor="red" stroked="f"/>
+          <v:shape id="_x0000_s2054" type="#_x0000_t187" style="position:absolute;margin-left:-28.65pt;margin-top:217.35pt;width:15.6pt;height:15.6pt;z-index:251658752" adj="6735" fillcolor="red" stroked="f"/>
         </w:pict>
       </w:r>
       <w:r>
@@ -326,7 +380,7 @@
           <w:lang w:eastAsia="es-CL"/>
         </w:rPr>
         <w:pict w14:anchorId="57A731C3">
-          <v:roundrect id="_x0000_s2053" style="position:absolute;margin-left:-21.9pt;margin-top:238.3pt;width:1.4pt;height:255pt;flip:x;z-index:2" arcsize="10923f" fillcolor="#06f" strokecolor="#06f"/>
+          <v:roundrect id="_x0000_s2053" style="position:absolute;margin-left:-21.9pt;margin-top:238.3pt;width:1.4pt;height:255pt;flip:x;z-index:251657728" arcsize="10923f" fillcolor="#06f" strokecolor="#06f"/>
         </w:pict>
       </w:r>
       <w:r>
@@ -409,6 +463,7 @@
                 <w:sz w:val="20"/>
               </w:rPr>
             </w:pPr>
+            <w:proofErr w:type="spellStart"/>
             <w:r>
               <w:rPr>
                 <w:rFonts w:ascii="Tahoma" w:hAnsi="Tahoma" w:cs="Tahoma"/>
@@ -416,6 +471,7 @@
               </w:rPr>
               <w:t>Codigo</w:t>
             </w:r>
+            <w:proofErr w:type="spellEnd"/>
           </w:p>
         </w:tc>
         <w:tc>
@@ -516,7 +572,7 @@
       </w:tr>
       <w:tr>
         <w:trPr>
-          <w:trHeight w:val="205"/>
+          <w:trHeight w:hRule="exact" w:val="20"/>
         </w:trPr>
         <w:tc>
           <w:tcPr>
@@ -536,7 +592,23 @@
                 <w:rFonts w:ascii="Tahoma" w:hAnsi="Tahoma" w:cs="Tahoma"/>
                 <w:sz w:val="20"/>
               </w:rPr>
-              <w:t>{% for detalle in detalles %}</w:t>
+              <w:t xml:space="preserve">{% </w:t>
+            </w:r>
+            <w:proofErr w:type="spellStart"/>
+            <w:r>
+              <w:rPr>
+                <w:rFonts w:ascii="Tahoma" w:hAnsi="Tahoma" w:cs="Tahoma"/>
+                <w:sz w:val="20"/>
+              </w:rPr>
+              <w:t>for</w:t>
+            </w:r>
+            <w:proofErr w:type="spellEnd"/>
+            <w:r>
+              <w:rPr>
+                <w:rFonts w:ascii="Tahoma" w:hAnsi="Tahoma" w:cs="Tahoma"/>
+                <w:sz w:val="20"/>
+              </w:rPr>
+              <w:t xml:space="preserve"> detalle in detalles %}</w:t>
             </w:r>
           </w:p>
         </w:tc>
@@ -563,7 +635,25 @@
                 <w:rFonts w:ascii="Tahoma" w:hAnsi="Tahoma" w:cs="Tahoma"/>
                 <w:sz w:val="20"/>
               </w:rPr>
-              <w:t xml:space="preserve">{{detalle.cantidad}} </w:t>
+              <w:t>{{</w:t>
+            </w:r>
+            <w:proofErr w:type="spellStart"/>
+            <w:proofErr w:type="gramStart"/>
+            <w:r>
+              <w:rPr>
+                <w:rFonts w:ascii="Tahoma" w:hAnsi="Tahoma" w:cs="Tahoma"/>
+                <w:sz w:val="20"/>
+              </w:rPr>
+              <w:t>detalle.cantidad</w:t>
+            </w:r>
+            <w:proofErr w:type="spellEnd"/>
+            <w:proofErr w:type="gramEnd"/>
+            <w:r>
+              <w:rPr>
+                <w:rFonts w:ascii="Tahoma" w:hAnsi="Tahoma" w:cs="Tahoma"/>
+                <w:sz w:val="20"/>
+              </w:rPr>
+              <w:t xml:space="preserve">}} </w:t>
             </w:r>
           </w:p>
           <w:p>
@@ -608,6 +698,7 @@
               </w:rPr>
               <w:t xml:space="preserve"> </w:t>
             </w:r>
+            <w:proofErr w:type="spellStart"/>
             <w:r>
               <w:rPr>
                 <w:rFonts w:ascii="Tahoma" w:hAnsi="Tahoma" w:cs="Tahoma"/>
@@ -616,6 +707,7 @@
               </w:rPr>
               <w:t>codigo_curso</w:t>
             </w:r>
+            <w:proofErr w:type="spellEnd"/>
             <w:r>
               <w:rPr>
                 <w:rFonts w:ascii="Tahoma" w:hAnsi="Tahoma" w:cs="Tahoma"/>
@@ -644,7 +736,27 @@
                 <w:sz w:val="20"/>
                 <w:lang w:eastAsia="en-US"/>
               </w:rPr>
-              <w:t>{{detalle.curso}}</w:t>
+              <w:t>{{</w:t>
+            </w:r>
+            <w:proofErr w:type="spellStart"/>
+            <w:proofErr w:type="gramStart"/>
+            <w:r>
+              <w:rPr>
+                <w:rFonts w:ascii="Tahoma" w:hAnsi="Tahoma" w:cs="Tahoma"/>
+                <w:sz w:val="20"/>
+                <w:lang w:eastAsia="en-US"/>
+              </w:rPr>
+              <w:t>detalle.curso</w:t>
+            </w:r>
+            <w:proofErr w:type="spellEnd"/>
+            <w:proofErr w:type="gramEnd"/>
+            <w:r>
+              <w:rPr>
+                <w:rFonts w:ascii="Tahoma" w:hAnsi="Tahoma" w:cs="Tahoma"/>
+                <w:sz w:val="20"/>
+                <w:lang w:eastAsia="en-US"/>
+              </w:rPr>
+              <w:t>}}</w:t>
             </w:r>
           </w:p>
         </w:tc>
@@ -665,7 +777,32 @@
                 <w:rFonts w:ascii="Tahoma" w:hAnsi="Tahoma" w:cs="Tahoma"/>
                 <w:sz w:val="20"/>
               </w:rPr>
-              <w:t>{{detalle.valor_unitario}}</w:t>
+              <w:t>{{</w:t>
+            </w:r>
+            <w:proofErr w:type="spellStart"/>
+            <w:proofErr w:type="gramStart"/>
+            <w:r>
+              <w:rPr>
+                <w:rFonts w:ascii="Tahoma" w:hAnsi="Tahoma" w:cs="Tahoma"/>
+                <w:sz w:val="20"/>
+              </w:rPr>
+              <w:t>detalle.valor</w:t>
+            </w:r>
+            <w:proofErr w:type="gramEnd"/>
+            <w:r>
+              <w:rPr>
+                <w:rFonts w:ascii="Tahoma" w:hAnsi="Tahoma" w:cs="Tahoma"/>
+                <w:sz w:val="20"/>
+              </w:rPr>
+              <w:t>_unitario</w:t>
+            </w:r>
+            <w:proofErr w:type="spellEnd"/>
+            <w:r>
+              <w:rPr>
+                <w:rFonts w:ascii="Tahoma" w:hAnsi="Tahoma" w:cs="Tahoma"/>
+                <w:sz w:val="20"/>
+              </w:rPr>
+              <w:t>}}</w:t>
             </w:r>
           </w:p>
           <w:p>
@@ -695,7 +832,32 @@
                 <w:rFonts w:ascii="Tahoma" w:hAnsi="Tahoma" w:cs="Tahoma"/>
                 <w:sz w:val="20"/>
               </w:rPr>
-              <w:t>{{detalle.valor_total}}</w:t>
+              <w:t>{{</w:t>
+            </w:r>
+            <w:proofErr w:type="spellStart"/>
+            <w:proofErr w:type="gramStart"/>
+            <w:r>
+              <w:rPr>
+                <w:rFonts w:ascii="Tahoma" w:hAnsi="Tahoma" w:cs="Tahoma"/>
+                <w:sz w:val="20"/>
+              </w:rPr>
+              <w:t>detalle.valor</w:t>
+            </w:r>
+            <w:proofErr w:type="gramEnd"/>
+            <w:r>
+              <w:rPr>
+                <w:rFonts w:ascii="Tahoma" w:hAnsi="Tahoma" w:cs="Tahoma"/>
+                <w:sz w:val="20"/>
+              </w:rPr>
+              <w:t>_total</w:t>
+            </w:r>
+            <w:proofErr w:type="spellEnd"/>
+            <w:r>
+              <w:rPr>
+                <w:rFonts w:ascii="Tahoma" w:hAnsi="Tahoma" w:cs="Tahoma"/>
+                <w:sz w:val="20"/>
+              </w:rPr>
+              <w:t>}}</w:t>
             </w:r>
           </w:p>
           <w:p>
@@ -711,7 +873,7 @@
       </w:tr>
       <w:tr>
         <w:trPr>
-          <w:trHeight w:val="215"/>
+          <w:trHeight w:hRule="exact" w:val="20"/>
         </w:trPr>
         <w:tc>
           <w:tcPr>
@@ -725,24 +887,49 @@
                 <w:rFonts w:ascii="Tahoma" w:hAnsi="Tahoma" w:cs="Tahoma"/>
                 <w:b/>
                 <w:bCs/>
-                <w:szCs w:val="22"/>
-              </w:rPr>
-            </w:pPr>
-            <w:r>
-              <w:rPr>
-                <w:rFonts w:ascii="Tahoma" w:hAnsi="Tahoma" w:cs="Tahoma"/>
-                <w:sz w:val="20"/>
-              </w:rPr>
-              <w:t>{% endfor %}</w:t>
-            </w:r>
-          </w:p>
+                <w:sz w:val="20"/>
+              </w:rPr>
+            </w:pPr>
+            <w:r>
+              <w:rPr>
+                <w:rFonts w:ascii="Tahoma" w:hAnsi="Tahoma" w:cs="Tahoma"/>
+                <w:sz w:val="20"/>
+              </w:rPr>
+              <w:t xml:space="preserve">{% </w:t>
+            </w:r>
+            <w:proofErr w:type="spellStart"/>
+            <w:r>
+              <w:rPr>
+                <w:rFonts w:ascii="Tahoma" w:hAnsi="Tahoma" w:cs="Tahoma"/>
+                <w:sz w:val="20"/>
+              </w:rPr>
+              <w:t>endfor</w:t>
+            </w:r>
+            <w:proofErr w:type="spellEnd"/>
+            <w:r>
+              <w:rPr>
+                <w:rFonts w:ascii="Tahoma" w:hAnsi="Tahoma" w:cs="Tahoma"/>
+                <w:sz w:val="20"/>
+              </w:rPr>
+              <w:t xml:space="preserve"> %}</w:t>
+            </w:r>
+          </w:p>
+        </w:tc>
+      </w:tr>
+      <w:tr>
+        <w:trPr>
+          <w:trHeight w:val="320"/>
+        </w:trPr>
+        <w:tc>
+          <w:tcPr>
+            <w:tcW w:w="10598" w:type="dxa"/>
+            <w:gridSpan w:val="7"/>
+          </w:tcPr>
           <w:p>
             <w:pPr>
               <w:jc w:val="center"/>
               <w:rPr>
                 <w:rFonts w:ascii="Tahoma" w:hAnsi="Tahoma" w:cs="Tahoma"/>
-                <w:b/>
-                <w:bCs/>
                 <w:sz w:val="20"/>
               </w:rPr>
             </w:pPr>
@@ -762,7 +949,27 @@
                 <w:bCs/>
                 <w:szCs w:val="22"/>
               </w:rPr>
-              <w:t>{{modo_completo}}</w:t>
+              <w:t>{{</w:t>
+            </w:r>
+            <w:proofErr w:type="spellStart"/>
+            <w:r>
+              <w:rPr>
+                <w:rFonts w:ascii="Tahoma" w:hAnsi="Tahoma" w:cs="Tahoma"/>
+                <w:b/>
+                <w:bCs/>
+                <w:szCs w:val="22"/>
+              </w:rPr>
+              <w:t>modo_completo</w:t>
+            </w:r>
+            <w:proofErr w:type="spellEnd"/>
+            <w:r>
+              <w:rPr>
+                <w:rFonts w:ascii="Tahoma" w:hAnsi="Tahoma" w:cs="Tahoma"/>
+                <w:b/>
+                <w:bCs/>
+                <w:szCs w:val="22"/>
+              </w:rPr>
+              <w:t>}}</w:t>
             </w:r>
           </w:p>
         </w:tc>
@@ -1323,13 +1530,23 @@
                 <w:szCs w:val="24"/>
               </w:rPr>
             </w:pPr>
+            <w:proofErr w:type="gramStart"/>
             <w:r>
               <w:rPr>
                 <w:rFonts w:ascii="Tahoma" w:hAnsi="Tahoma" w:cs="Tahoma"/>
                 <w:sz w:val="24"/>
                 <w:szCs w:val="24"/>
               </w:rPr>
-              <w:t>{{ encargado }</w:t>
+              <w:t>{{ encargado</w:t>
+            </w:r>
+            <w:proofErr w:type="gramEnd"/>
+            <w:r>
+              <w:rPr>
+                <w:rFonts w:ascii="Tahoma" w:hAnsi="Tahoma" w:cs="Tahoma"/>
+                <w:sz w:val="24"/>
+                <w:szCs w:val="24"/>
+              </w:rPr>
+              <w:t xml:space="preserve"> }</w:t>
             </w:r>
             <w:r>
               <w:rPr>
@@ -1377,7 +1594,7 @@
           <w:lang w:eastAsia="es-CL"/>
         </w:rPr>
         <w:pict w14:anchorId="442CFB4A">
-          <v:roundrect id="_x0000_s2051" style="position:absolute;margin-left:162.05pt;margin-top:-193pt;width:1.4pt;height:415.75pt;rotation:90;flip:x y;z-index:1;mso-position-horizontal-relative:text;mso-position-vertical-relative:text" arcsize=".5" fillcolor="#06f" strokecolor="#06f"/>
+          <v:roundrect id="_x0000_s2051" style="position:absolute;margin-left:162.05pt;margin-top:-193pt;width:1.4pt;height:415.75pt;rotation:90;flip:x y;z-index:251656704;mso-position-horizontal-relative:text;mso-position-vertical-relative:text" arcsize=".5" fillcolor="#06f" strokecolor="#06f"/>
         </w:pict>
       </w:r>
     </w:p>
@@ -1446,7 +1663,29 @@
         <w:szCs w:val="18"/>
         <w:lang w:val="es-ES_tradnl" w:eastAsia="es-ES_tradnl"/>
       </w:rPr>
-      <w:t xml:space="preserve"> Esmeralda 940, 3er piso, Oficina 31  Valparaíso, Chile</w:t>
+      <w:t xml:space="preserve"> Esmeralda 940, 3er piso, Oficina </w:t>
+    </w:r>
+    <w:proofErr w:type="gramStart"/>
+    <w:r>
+      <w:rPr>
+        <w:rFonts w:cs="Arial"/>
+        <w:color w:val="1F497D"/>
+        <w:sz w:val="18"/>
+        <w:szCs w:val="18"/>
+        <w:lang w:val="es-ES_tradnl" w:eastAsia="es-ES_tradnl"/>
+      </w:rPr>
+      <w:t>31  Valparaíso</w:t>
+    </w:r>
+    <w:proofErr w:type="gramEnd"/>
+    <w:r>
+      <w:rPr>
+        <w:rFonts w:cs="Arial"/>
+        <w:color w:val="1F497D"/>
+        <w:sz w:val="18"/>
+        <w:szCs w:val="18"/>
+        <w:lang w:val="es-ES_tradnl" w:eastAsia="es-ES_tradnl"/>
+      </w:rPr>
+      <w:t>, Chile</w:t>
     </w:r>
   </w:p>
   <w:p>
@@ -1588,7 +1827,7 @@
           <v:path o:extrusionok="f" gradientshapeok="t" o:connecttype="rect"/>
           <o:lock v:ext="edit" aspectratio="t"/>
         </v:shapetype>
-        <v:shape id="WordPictureWatermark8939373" o:spid="_x0000_s1044" type="#_x0000_t75" style="position:absolute;margin-left:0;margin-top:0;width:484.45pt;height:371.75pt;z-index:-3;mso-position-horizontal:center;mso-position-horizontal-relative:margin;mso-position-vertical:center;mso-position-vertical-relative:margin" o:allowincell="f">
+        <v:shape id="WordPictureWatermark8939373" o:spid="_x0000_s1044" type="#_x0000_t75" style="position:absolute;margin-left:0;margin-top:0;width:484.45pt;height:371.75pt;z-index:-251659776;mso-position-horizontal:center;mso-position-horizontal-relative:margin;mso-position-vertical:center;mso-position-vertical-relative:margin" o:allowincell="f">
           <v:imagedata r:id="rId1" o:title="1" gain="19661f" blacklevel="22938f"/>
           <w10:wrap anchorx="margin" anchory="margin"/>
         </v:shape>
@@ -1640,7 +1879,7 @@
           <v:path o:extrusionok="f" gradientshapeok="t" o:connecttype="rect"/>
           <o:lock v:ext="edit" aspectratio="t"/>
         </v:shapetype>
-        <v:shape id="WordPictureWatermark8939374" o:spid="_x0000_s1045" type="#_x0000_t75" style="position:absolute;left:0;text-align:left;margin-left:0;margin-top:0;width:484.45pt;height:371.75pt;z-index:-2;mso-position-horizontal:center;mso-position-horizontal-relative:margin;mso-position-vertical:center;mso-position-vertical-relative:margin" o:allowincell="f">
+        <v:shape id="WordPictureWatermark8939374" o:spid="_x0000_s1045" type="#_x0000_t75" style="position:absolute;left:0;text-align:left;margin-left:0;margin-top:0;width:484.45pt;height:371.75pt;z-index:-251658752;mso-position-horizontal:center;mso-position-horizontal-relative:margin;mso-position-vertical:center;mso-position-vertical-relative:margin" o:allowincell="f">
           <v:imagedata r:id="rId1" o:title="1" gain="19661f" blacklevel="22938f"/>
           <w10:wrap anchorx="margin" anchory="margin"/>
         </v:shape>
@@ -1720,7 +1959,7 @@
                 <v:path o:extrusionok="f" gradientshapeok="t" o:connecttype="rect"/>
                 <o:lock v:ext="edit" aspectratio="t"/>
               </v:shapetype>
-              <v:shape id="_x0000_i1025" type="#_x0000_t75" style="width:94pt;height:61pt">
+              <v:shape id="_x0000_i1025" type="#_x0000_t75" style="width:94.45pt;height:60.8pt">
                 <v:imagedata r:id="rId1" o:title="Opción Miniatura"/>
               </v:shape>
             </w:pict>
@@ -1734,7 +1973,7 @@
               <w:lang w:val="es-CL" w:eastAsia="es-CL"/>
             </w:rPr>
             <w:pict w14:anchorId="2572227F">
-              <v:shape id="WordPictureWatermark8939372" o:spid="_x0000_s1049" type="#_x0000_t75" style="position:absolute;margin-left:0;margin-top:0;width:484.45pt;height:371.75pt;z-index:-1;mso-position-horizontal:center;mso-position-horizontal-relative:margin;mso-position-vertical:center;mso-position-vertical-relative:margin" o:allowincell="f">
+              <v:shape id="WordPictureWatermark8939372" o:spid="_x0000_s1049" type="#_x0000_t75" style="position:absolute;margin-left:0;margin-top:0;width:484.45pt;height:371.75pt;z-index:-251657728;mso-position-horizontal:center;mso-position-horizontal-relative:margin;mso-position-vertical:center;mso-position-vertical-relative:margin" o:allowincell="f">
                 <v:imagedata r:id="rId2" o:title="1" gain="19661f" blacklevel="22938f"/>
                 <w10:wrap anchorx="margin" anchory="margin"/>
               </v:shape>
@@ -1858,7 +2097,31 @@
               <w:szCs w:val="24"/>
               <w:lang w:val="es-CL"/>
             </w:rPr>
-            <w:t>{{numero_cotizacion}}</w:t>
+            <w:t>{{</w:t>
+          </w:r>
+          <w:proofErr w:type="spellStart"/>
+          <w:r>
+            <w:rPr>
+              <w:rFonts w:ascii="Tahoma" w:hAnsi="Tahoma" w:cs="Tahoma"/>
+              <w:b/>
+              <w:bCs/>
+              <w:sz w:val="24"/>
+              <w:szCs w:val="24"/>
+              <w:lang w:val="es-CL"/>
+            </w:rPr>
+            <w:t>numero_cotizacion</w:t>
+          </w:r>
+          <w:proofErr w:type="spellEnd"/>
+          <w:r>
+            <w:rPr>
+              <w:rFonts w:ascii="Tahoma" w:hAnsi="Tahoma" w:cs="Tahoma"/>
+              <w:b/>
+              <w:bCs/>
+              <w:sz w:val="24"/>
+              <w:szCs w:val="24"/>
+              <w:lang w:val="es-CL"/>
+            </w:rPr>
+            <w:t>}}</w:t>
           </w:r>
           <w:r>
             <w:rPr>
@@ -1879,7 +2142,31 @@
               <w:szCs w:val="24"/>
               <w:lang w:val="es-CL"/>
             </w:rPr>
-            <w:t>{{year}}</w:t>
+            <w:t>{{</w:t>
+          </w:r>
+          <w:proofErr w:type="spellStart"/>
+          <w:r>
+            <w:rPr>
+              <w:rFonts w:ascii="Tahoma" w:hAnsi="Tahoma" w:cs="Tahoma"/>
+              <w:b/>
+              <w:bCs/>
+              <w:sz w:val="24"/>
+              <w:szCs w:val="24"/>
+              <w:lang w:val="es-CL"/>
+            </w:rPr>
+            <w:t>year</w:t>
+          </w:r>
+          <w:proofErr w:type="spellEnd"/>
+          <w:r>
+            <w:rPr>
+              <w:rFonts w:ascii="Tahoma" w:hAnsi="Tahoma" w:cs="Tahoma"/>
+              <w:b/>
+              <w:bCs/>
+              <w:sz w:val="24"/>
+              <w:szCs w:val="24"/>
+              <w:lang w:val="es-CL"/>
+            </w:rPr>
+            <w:t>}}</w:t>
           </w:r>
         </w:p>
       </w:tc>

</xml_diff>